<commit_message>
DB arrangments for multi people leaderboard
</commit_message>
<xml_diff>
--- a/Documentation.docx
+++ b/Documentation.docx
@@ -4,31 +4,7 @@
   <w:body>
     <w:p>
       <w:r>
-        <w:t xml:space="preserve"># 1) </w:t>
-      </w:r>
-      <w:proofErr w:type="spellStart"/>
-      <w:r>
-        <w:t>Root'a</w:t>
-      </w:r>
-      <w:proofErr w:type="spellEnd"/>
-      <w:r>
-        <w:t xml:space="preserve"> git + </w:t>
-      </w:r>
-      <w:proofErr w:type="spellStart"/>
-      <w:r>
-        <w:t>venv</w:t>
-      </w:r>
-      <w:proofErr w:type="spellEnd"/>
-      <w:r>
-        <w:t xml:space="preserve"> </w:t>
-      </w:r>
-      <w:proofErr w:type="spellStart"/>
-      <w:r>
-        <w:t>aktif</w:t>
-      </w:r>
-      <w:proofErr w:type="spellEnd"/>
-      <w:r>
-        <w:t xml:space="preserve"> et</w:t>
+        <w:t># 1) Root'a git + venv aktif et</w:t>
       </w:r>
     </w:p>
     <w:p>
@@ -38,39 +14,18 @@
     </w:p>
     <w:p>
       <w:r>
-        <w:t>&amp; ".\.</w:t>
-      </w:r>
-      <w:proofErr w:type="spellStart"/>
-      <w:r>
-        <w:t>venv</w:t>
-      </w:r>
-      <w:proofErr w:type="spellEnd"/>
-      <w:r>
-        <w:t>\Scripts\Activate.ps1"</w:t>
+        <w:t>&amp; ".\.venv\Scripts\Activate.ps1"</w:t>
       </w:r>
     </w:p>
     <w:p/>
     <w:p>
       <w:r>
-        <w:t xml:space="preserve"># 2) Backend dependency </w:t>
+        <w:t># 2) Backend dependency kur</w:t>
       </w:r>
-      <w:proofErr w:type="spellStart"/>
-      <w:r>
-        <w:t>kur</w:t>
-      </w:r>
-      <w:proofErr w:type="spellEnd"/>
     </w:p>
     <w:p>
       <w:r>
-        <w:t>cd ".\</w:t>
-      </w:r>
-      <w:proofErr w:type="spellStart"/>
-      <w:r>
-        <w:t>arya_fullstack_app</w:t>
-      </w:r>
-      <w:proofErr w:type="spellEnd"/>
-      <w:r>
-        <w:t>\server"</w:t>
+        <w:t>cd ".\arya_fullstack_app\server"</w:t>
       </w:r>
     </w:p>
     <w:p>
@@ -81,40 +36,360 @@
     <w:p/>
     <w:p>
       <w:r>
-        <w:t xml:space="preserve"># 3) </w:t>
+        <w:t># 3) FastAPI server başlat</w:t>
       </w:r>
-      <w:proofErr w:type="spellStart"/>
-      <w:r>
-        <w:t>FastAPI</w:t>
-      </w:r>
-      <w:proofErr w:type="spellEnd"/>
-      <w:r>
-        <w:t xml:space="preserve"> server </w:t>
-      </w:r>
-      <w:proofErr w:type="spellStart"/>
-      <w:r>
-        <w:t>başlat</w:t>
-      </w:r>
-      <w:proofErr w:type="spellEnd"/>
     </w:p>
     <w:p>
-      <w:proofErr w:type="spellStart"/>
       <w:r>
-        <w:t>uvicorn</w:t>
-      </w:r>
-      <w:proofErr w:type="spellEnd"/>
-      <w:r>
-        <w:t xml:space="preserve"> </w:t>
-      </w:r>
-      <w:proofErr w:type="spellStart"/>
-      <w:r>
-        <w:t>app.main:app</w:t>
-      </w:r>
-      <w:proofErr w:type="spellEnd"/>
-      <w:r>
-        <w:t xml:space="preserve"> --reload --port 8000</w:t>
+        <w:t>uvicorn app.main:app --reload --port 8000</w:t>
       </w:r>
     </w:p>
+    <w:p/>
+    <w:p/>
+    <w:p/>
+    <w:p/>
+    <w:p/>
+    <w:p/>
+    <w:p/>
+    <w:p/>
+    <w:p/>
+    <w:p/>
+    <w:p/>
+    <w:p/>
+    <w:p/>
+    <w:p/>
+    <w:p/>
+    <w:p/>
+    <w:p/>
+    <w:p/>
+    <w:p/>
+    <w:p>
+      <w:pPr>
+        <w:pStyle w:val="Heading1"/>
+        <w:spacing w:before="0" w:after="160"/>
+      </w:pPr>
+      <w:r>
+        <w:lastRenderedPageBreak/>
+        <w:t>1. Overall structure of the case</w:t>
+      </w:r>
+    </w:p>
+    <w:p>
+      <w:r>
+        <w:t xml:space="preserve">The </w:t>
+      </w:r>
+      <w:r>
+        <w:t>Arya Phones game</w:t>
+      </w:r>
+      <w:r>
+        <w:t xml:space="preserve"> contains two different but complementary decision problems. The first problem decides which suppliers should be selected together</w:t>
+      </w:r>
+      <w:r>
+        <w:t>, compared to a baseline</w:t>
+      </w:r>
+      <w:r>
+        <w:t>. The second problem assigns users to appropriate market options. From a business perspective, this distinction matters: the first is a portfolio design problem, while the second is an operational allocation problem.</w:t>
+      </w:r>
+    </w:p>
+    <w:tbl>
+      <w:tblPr>
+        <w:tblW w:w="0" w:type="auto"/>
+        <w:jc w:val="center"/>
+        <w:tblLayout w:type="fixed"/>
+        <w:tblLook w:val="04A0" w:firstRow="1" w:lastRow="0" w:firstColumn="1" w:lastColumn="0" w:noHBand="0" w:noVBand="1"/>
+      </w:tblPr>
+      <w:tblGrid>
+        <w:gridCol w:w="3264"/>
+        <w:gridCol w:w="3264"/>
+        <w:gridCol w:w="3264"/>
+      </w:tblGrid>
+      <w:tr>
+        <w:trPr>
+          <w:jc w:val="center"/>
+        </w:trPr>
+        <w:tc>
+          <w:tcPr>
+            <w:tcW w:w="3264" w:type="dxa"/>
+            <w:shd w:val="clear" w:color="auto" w:fill="B9CDE5"/>
+            <w:tcMar>
+              <w:top w:w="80" w:type="dxa"/>
+              <w:left w:w="110" w:type="dxa"/>
+              <w:bottom w:w="80" w:type="dxa"/>
+              <w:right w:w="110" w:type="dxa"/>
+            </w:tcMar>
+          </w:tcPr>
+          <w:p>
+            <w:pPr>
+              <w:spacing w:after="0"/>
+              <w:jc w:val="center"/>
+            </w:pPr>
+            <w:r>
+              <w:t>Stage</w:t>
+            </w:r>
+          </w:p>
+        </w:tc>
+        <w:tc>
+          <w:tcPr>
+            <w:tcW w:w="3264" w:type="dxa"/>
+            <w:shd w:val="clear" w:color="auto" w:fill="B9CDE5"/>
+            <w:tcMar>
+              <w:top w:w="80" w:type="dxa"/>
+              <w:left w:w="110" w:type="dxa"/>
+              <w:bottom w:w="80" w:type="dxa"/>
+              <w:right w:w="110" w:type="dxa"/>
+            </w:tcMar>
+          </w:tcPr>
+          <w:p>
+            <w:pPr>
+              <w:spacing w:after="0"/>
+              <w:jc w:val="center"/>
+            </w:pPr>
+            <w:r>
+              <w:t>Decision question</w:t>
+            </w:r>
+          </w:p>
+        </w:tc>
+        <w:tc>
+          <w:tcPr>
+            <w:tcW w:w="3264" w:type="dxa"/>
+            <w:shd w:val="clear" w:color="auto" w:fill="B9CDE5"/>
+            <w:tcMar>
+              <w:top w:w="80" w:type="dxa"/>
+              <w:left w:w="110" w:type="dxa"/>
+              <w:bottom w:w="80" w:type="dxa"/>
+              <w:right w:w="110" w:type="dxa"/>
+            </w:tcMar>
+          </w:tcPr>
+          <w:p>
+            <w:pPr>
+              <w:spacing w:after="0"/>
+              <w:jc w:val="center"/>
+            </w:pPr>
+            <w:r>
+              <w:t>Business interpretation</w:t>
+            </w:r>
+          </w:p>
+        </w:tc>
+      </w:tr>
+      <w:tr>
+        <w:trPr>
+          <w:jc w:val="center"/>
+        </w:trPr>
+        <w:tc>
+          <w:tcPr>
+            <w:tcW w:w="3264" w:type="dxa"/>
+            <w:shd w:val="clear" w:color="auto" w:fill="F8FBFE"/>
+            <w:tcMar>
+              <w:top w:w="80" w:type="dxa"/>
+              <w:left w:w="110" w:type="dxa"/>
+              <w:bottom w:w="80" w:type="dxa"/>
+              <w:right w:w="110" w:type="dxa"/>
+            </w:tcMar>
+            <w:vAlign w:val="center"/>
+          </w:tcPr>
+          <w:p>
+            <w:pPr>
+              <w:spacing w:after="0"/>
+              <w:jc w:val="center"/>
+            </w:pPr>
+            <w:r>
+              <w:t>1</w:t>
+            </w:r>
+          </w:p>
+        </w:tc>
+        <w:tc>
+          <w:tcPr>
+            <w:tcW w:w="3264" w:type="dxa"/>
+            <w:shd w:val="clear" w:color="auto" w:fill="F8FBFE"/>
+            <w:tcMar>
+              <w:top w:w="80" w:type="dxa"/>
+              <w:left w:w="110" w:type="dxa"/>
+              <w:bottom w:w="80" w:type="dxa"/>
+              <w:right w:w="110" w:type="dxa"/>
+            </w:tcMar>
+            <w:vAlign w:val="center"/>
+          </w:tcPr>
+          <w:p>
+            <w:pPr>
+              <w:spacing w:after="0"/>
+            </w:pPr>
+            <w:r>
+              <w:t>Supplier set selection</w:t>
+            </w:r>
+          </w:p>
+        </w:tc>
+        <w:tc>
+          <w:tcPr>
+            <w:tcW w:w="3264" w:type="dxa"/>
+            <w:shd w:val="clear" w:color="auto" w:fill="F8FBFE"/>
+            <w:tcMar>
+              <w:top w:w="80" w:type="dxa"/>
+              <w:left w:w="110" w:type="dxa"/>
+              <w:bottom w:w="80" w:type="dxa"/>
+              <w:right w:w="110" w:type="dxa"/>
+            </w:tcMar>
+            <w:vAlign w:val="center"/>
+          </w:tcPr>
+          <w:p>
+            <w:pPr>
+              <w:spacing w:after="0"/>
+            </w:pPr>
+            <w:r>
+              <w:t>Which supplier combination delivers the target</w:t>
+            </w:r>
+            <w:r>
+              <w:t xml:space="preserve"> or best</w:t>
+            </w:r>
+            <w:r>
+              <w:t xml:space="preserve"> performance without exceeding the risk limits?</w:t>
+            </w:r>
+          </w:p>
+        </w:tc>
+      </w:tr>
+      <w:tr>
+        <w:trPr>
+          <w:jc w:val="center"/>
+        </w:trPr>
+        <w:tc>
+          <w:tcPr>
+            <w:tcW w:w="3264" w:type="dxa"/>
+            <w:shd w:val="clear" w:color="auto" w:fill="EEF4FA"/>
+            <w:tcMar>
+              <w:top w:w="80" w:type="dxa"/>
+              <w:left w:w="110" w:type="dxa"/>
+              <w:bottom w:w="80" w:type="dxa"/>
+              <w:right w:w="110" w:type="dxa"/>
+            </w:tcMar>
+            <w:vAlign w:val="center"/>
+          </w:tcPr>
+          <w:p>
+            <w:pPr>
+              <w:spacing w:after="0"/>
+              <w:jc w:val="center"/>
+            </w:pPr>
+            <w:r>
+              <w:t>2</w:t>
+            </w:r>
+          </w:p>
+        </w:tc>
+        <w:tc>
+          <w:tcPr>
+            <w:tcW w:w="3264" w:type="dxa"/>
+            <w:shd w:val="clear" w:color="auto" w:fill="EEF4FA"/>
+            <w:tcMar>
+              <w:top w:w="80" w:type="dxa"/>
+              <w:left w:w="110" w:type="dxa"/>
+              <w:bottom w:w="80" w:type="dxa"/>
+              <w:right w:w="110" w:type="dxa"/>
+            </w:tcMar>
+            <w:vAlign w:val="center"/>
+          </w:tcPr>
+          <w:p>
+            <w:pPr>
+              <w:spacing w:after="0"/>
+            </w:pPr>
+            <w:r>
+              <w:t>Average portfolio creation</w:t>
+            </w:r>
+          </w:p>
+        </w:tc>
+        <w:tc>
+          <w:tcPr>
+            <w:tcW w:w="3264" w:type="dxa"/>
+            <w:shd w:val="clear" w:color="auto" w:fill="EEF4FA"/>
+            <w:tcMar>
+              <w:top w:w="80" w:type="dxa"/>
+              <w:left w:w="110" w:type="dxa"/>
+              <w:bottom w:w="80" w:type="dxa"/>
+              <w:right w:w="110" w:type="dxa"/>
+            </w:tcMar>
+            <w:vAlign w:val="center"/>
+          </w:tcPr>
+          <w:p>
+            <w:pPr>
+              <w:spacing w:after="0"/>
+            </w:pPr>
+            <w:r>
+              <w:t>The selected suppliers are treated not as a single product, but as a portfolio with average characteristics.</w:t>
+            </w:r>
+          </w:p>
+        </w:tc>
+      </w:tr>
+      <w:tr>
+        <w:trPr>
+          <w:jc w:val="center"/>
+        </w:trPr>
+        <w:tc>
+          <w:tcPr>
+            <w:tcW w:w="3264" w:type="dxa"/>
+            <w:shd w:val="clear" w:color="auto" w:fill="F8FBFE"/>
+            <w:tcMar>
+              <w:top w:w="80" w:type="dxa"/>
+              <w:left w:w="110" w:type="dxa"/>
+              <w:bottom w:w="80" w:type="dxa"/>
+              <w:right w:w="110" w:type="dxa"/>
+            </w:tcMar>
+            <w:vAlign w:val="center"/>
+          </w:tcPr>
+          <w:p>
+            <w:pPr>
+              <w:spacing w:after="0"/>
+              <w:jc w:val="center"/>
+            </w:pPr>
+            <w:r>
+              <w:t>3</w:t>
+            </w:r>
+          </w:p>
+        </w:tc>
+        <w:tc>
+          <w:tcPr>
+            <w:tcW w:w="3264" w:type="dxa"/>
+            <w:shd w:val="clear" w:color="auto" w:fill="F8FBFE"/>
+            <w:tcMar>
+              <w:top w:w="80" w:type="dxa"/>
+              <w:left w:w="110" w:type="dxa"/>
+              <w:bottom w:w="80" w:type="dxa"/>
+              <w:right w:w="110" w:type="dxa"/>
+            </w:tcMar>
+            <w:vAlign w:val="center"/>
+          </w:tcPr>
+          <w:p>
+            <w:pPr>
+              <w:spacing w:after="0"/>
+            </w:pPr>
+            <w:r>
+              <w:t>User-market matching</w:t>
+            </w:r>
+          </w:p>
+        </w:tc>
+        <w:tc>
+          <w:tcPr>
+            <w:tcW w:w="3264" w:type="dxa"/>
+            <w:shd w:val="clear" w:color="auto" w:fill="F8FBFE"/>
+            <w:tcMar>
+              <w:top w:w="80" w:type="dxa"/>
+              <w:left w:w="110" w:type="dxa"/>
+              <w:bottom w:w="80" w:type="dxa"/>
+              <w:right w:w="110" w:type="dxa"/>
+            </w:tcMar>
+            <w:vAlign w:val="center"/>
+          </w:tcPr>
+          <w:p>
+            <w:pPr>
+              <w:spacing w:after="0"/>
+            </w:pPr>
+            <w:r>
+              <w:t>Users are allocated to suitable options under capacity constraints.</w:t>
+            </w:r>
+            <w:r>
+              <w:t xml:space="preserve"> Many-to-one matching-like approach is the games aspect which allows a competition</w:t>
+            </w:r>
+          </w:p>
+        </w:tc>
+      </w:tr>
+    </w:tbl>
+    <w:p/>
+    <w:p/>
+    <w:p/>
     <w:sectPr>
       <w:pgSz w:w="12240" w:h="15840"/>
       <w:pgMar w:top="1417" w:right="1417" w:bottom="1417" w:left="1417" w:header="708" w:footer="708" w:gutter="0"/>

</xml_diff>

<commit_message>
edits for timer, admin and db writing
</commit_message>
<xml_diff>
--- a/Documentation.docx
+++ b/Documentation.docx
@@ -381,13 +381,375 @@
               <w:t>Users are allocated to suitable options under capacity constraints.</w:t>
             </w:r>
             <w:r>
-              <w:t xml:space="preserve"> Many-to-one matching-like approach is the games aspect which allows a competition</w:t>
+              <w:t xml:space="preserve"> </w:t>
+            </w:r>
+            <w:proofErr w:type="gramStart"/>
+            <w:r>
+              <w:t>Many-to-one</w:t>
+            </w:r>
+            <w:proofErr w:type="gramEnd"/>
+            <w:r>
+              <w:t xml:space="preserve"> matching-like approach is the games aspect which allows a competition</w:t>
+            </w:r>
+            <w:r>
+              <w:t>.</w:t>
             </w:r>
           </w:p>
         </w:tc>
       </w:tr>
     </w:tbl>
     <w:p/>
+    <w:p>
+      <w:pPr>
+        <w:pStyle w:val="Heading1"/>
+        <w:spacing w:before="200"/>
+      </w:pPr>
+      <w:r>
+        <w:t>2. Business logic of the supplier selection model</w:t>
+      </w:r>
+    </w:p>
+    <w:p>
+      <w:r>
+        <w:t xml:space="preserve">In this model, students do not have to choose a single supplier; they can choose any non-empty subset of suppliers. The output of the chosen subset is defined </w:t>
+      </w:r>
+      <w:proofErr w:type="gramStart"/>
+      <w:r>
+        <w:t>through</w:t>
+      </w:r>
+      <w:proofErr w:type="gramEnd"/>
+      <w:r>
+        <w:t xml:space="preserve"> the average attribute values of the selected suppliers. The code comments explicitly frame this as a supplier-set averaging game.</w:t>
+      </w:r>
+    </w:p>
+    <w:tbl>
+      <w:tblPr>
+        <w:tblW w:w="0" w:type="auto"/>
+        <w:jc w:val="center"/>
+        <w:tblLayout w:type="fixed"/>
+        <w:tblLook w:val="04A0" w:firstRow="1" w:lastRow="0" w:firstColumn="1" w:lastColumn="0" w:noHBand="0" w:noVBand="1"/>
+      </w:tblPr>
+      <w:tblGrid>
+        <w:gridCol w:w="4896"/>
+        <w:gridCol w:w="4896"/>
+      </w:tblGrid>
+      <w:tr>
+        <w:trPr>
+          <w:jc w:val="center"/>
+        </w:trPr>
+        <w:tc>
+          <w:tcPr>
+            <w:tcW w:w="4896" w:type="dxa"/>
+            <w:shd w:val="clear" w:color="auto" w:fill="EAF1F8"/>
+            <w:tcMar>
+              <w:top w:w="80" w:type="dxa"/>
+              <w:left w:w="110" w:type="dxa"/>
+              <w:bottom w:w="80" w:type="dxa"/>
+              <w:right w:w="110" w:type="dxa"/>
+            </w:tcMar>
+            <w:vAlign w:val="center"/>
+          </w:tcPr>
+          <w:p>
+            <w:pPr>
+              <w:spacing w:after="0"/>
+            </w:pPr>
+            <w:r>
+              <w:t>S</w:t>
+            </w:r>
+          </w:p>
+        </w:tc>
+        <w:tc>
+          <w:tcPr>
+            <w:tcW w:w="4896" w:type="dxa"/>
+            <w:shd w:val="clear" w:color="auto" w:fill="FCFEFF"/>
+            <w:tcMar>
+              <w:top w:w="80" w:type="dxa"/>
+              <w:left w:w="110" w:type="dxa"/>
+              <w:bottom w:w="80" w:type="dxa"/>
+              <w:right w:w="110" w:type="dxa"/>
+            </w:tcMar>
+            <w:vAlign w:val="center"/>
+          </w:tcPr>
+          <w:p>
+            <w:pPr>
+              <w:spacing w:after="0"/>
+            </w:pPr>
+            <w:r>
+              <w:t>Set of suppliers</w:t>
+            </w:r>
+          </w:p>
+        </w:tc>
+      </w:tr>
+      <w:tr>
+        <w:trPr>
+          <w:jc w:val="center"/>
+        </w:trPr>
+        <w:tc>
+          <w:tcPr>
+            <w:tcW w:w="4896" w:type="dxa"/>
+            <w:shd w:val="clear" w:color="auto" w:fill="EAF1F8"/>
+            <w:tcMar>
+              <w:top w:w="80" w:type="dxa"/>
+              <w:left w:w="110" w:type="dxa"/>
+              <w:bottom w:w="80" w:type="dxa"/>
+              <w:right w:w="110" w:type="dxa"/>
+            </w:tcMar>
+            <w:vAlign w:val="center"/>
+          </w:tcPr>
+          <w:p>
+            <w:pPr>
+              <w:spacing w:after="0"/>
+            </w:pPr>
+            <w:proofErr w:type="spellStart"/>
+            <w:r>
+              <w:t>y_i</w:t>
+            </w:r>
+            <w:proofErr w:type="spellEnd"/>
+          </w:p>
+        </w:tc>
+        <w:tc>
+          <w:tcPr>
+            <w:tcW w:w="4896" w:type="dxa"/>
+            <w:shd w:val="clear" w:color="auto" w:fill="FCFEFF"/>
+            <w:tcMar>
+              <w:top w:w="80" w:type="dxa"/>
+              <w:left w:w="110" w:type="dxa"/>
+              <w:bottom w:w="80" w:type="dxa"/>
+              <w:right w:w="110" w:type="dxa"/>
+            </w:tcMar>
+            <w:vAlign w:val="center"/>
+          </w:tcPr>
+          <w:p>
+            <w:pPr>
+              <w:spacing w:after="0"/>
+            </w:pPr>
+            <w:r>
+              <w:t xml:space="preserve">1 if supplier </w:t>
+            </w:r>
+            <w:proofErr w:type="spellStart"/>
+            <w:r>
+              <w:t>i</w:t>
+            </w:r>
+            <w:proofErr w:type="spellEnd"/>
+            <w:r>
+              <w:t xml:space="preserve"> is selected, 0 otherwise</w:t>
+            </w:r>
+          </w:p>
+        </w:tc>
+      </w:tr>
+      <w:tr>
+        <w:trPr>
+          <w:jc w:val="center"/>
+        </w:trPr>
+        <w:tc>
+          <w:tcPr>
+            <w:tcW w:w="4896" w:type="dxa"/>
+            <w:shd w:val="clear" w:color="auto" w:fill="EAF1F8"/>
+            <w:tcMar>
+              <w:top w:w="80" w:type="dxa"/>
+              <w:left w:w="110" w:type="dxa"/>
+              <w:bottom w:w="80" w:type="dxa"/>
+              <w:right w:w="110" w:type="dxa"/>
+            </w:tcMar>
+            <w:vAlign w:val="center"/>
+          </w:tcPr>
+          <w:p>
+            <w:pPr>
+              <w:spacing w:after="0"/>
+            </w:pPr>
+            <w:r>
+              <w:t>K</w:t>
+            </w:r>
+          </w:p>
+        </w:tc>
+        <w:tc>
+          <w:tcPr>
+            <w:tcW w:w="4896" w:type="dxa"/>
+            <w:shd w:val="clear" w:color="auto" w:fill="FCFEFF"/>
+            <w:tcMar>
+              <w:top w:w="80" w:type="dxa"/>
+              <w:left w:w="110" w:type="dxa"/>
+              <w:bottom w:w="80" w:type="dxa"/>
+              <w:right w:w="110" w:type="dxa"/>
+            </w:tcMar>
+            <w:vAlign w:val="center"/>
+          </w:tcPr>
+          <w:p>
+            <w:pPr>
+              <w:spacing w:after="0"/>
+            </w:pPr>
+            <w:r>
+              <w:t xml:space="preserve">Number of selected suppliers; k = </w:t>
+            </w:r>
+            <w:proofErr w:type="spellStart"/>
+            <w:r>
+              <w:t>sum_i</w:t>
+            </w:r>
+            <w:proofErr w:type="spellEnd"/>
+            <w:r>
+              <w:t xml:space="preserve"> </w:t>
+            </w:r>
+            <w:proofErr w:type="spellStart"/>
+            <w:r>
+              <w:t>y_i</w:t>
+            </w:r>
+            <w:proofErr w:type="spellEnd"/>
+          </w:p>
+        </w:tc>
+      </w:tr>
+      <w:tr>
+        <w:trPr>
+          <w:jc w:val="center"/>
+        </w:trPr>
+        <w:tc>
+          <w:tcPr>
+            <w:tcW w:w="4896" w:type="dxa"/>
+            <w:shd w:val="clear" w:color="auto" w:fill="EAF1F8"/>
+            <w:tcMar>
+              <w:top w:w="80" w:type="dxa"/>
+              <w:left w:w="110" w:type="dxa"/>
+              <w:bottom w:w="80" w:type="dxa"/>
+              <w:right w:w="110" w:type="dxa"/>
+            </w:tcMar>
+            <w:vAlign w:val="center"/>
+          </w:tcPr>
+          <w:p>
+            <w:pPr>
+              <w:spacing w:after="0"/>
+            </w:pPr>
+            <w:r>
+              <w:t>avg(metric)</w:t>
+            </w:r>
+          </w:p>
+        </w:tc>
+        <w:tc>
+          <w:tcPr>
+            <w:tcW w:w="4896" w:type="dxa"/>
+            <w:shd w:val="clear" w:color="auto" w:fill="FCFEFF"/>
+            <w:tcMar>
+              <w:top w:w="80" w:type="dxa"/>
+              <w:left w:w="110" w:type="dxa"/>
+              <w:bottom w:w="80" w:type="dxa"/>
+              <w:right w:w="110" w:type="dxa"/>
+            </w:tcMar>
+            <w:vAlign w:val="center"/>
+          </w:tcPr>
+          <w:p>
+            <w:pPr>
+              <w:spacing w:after="0"/>
+            </w:pPr>
+            <w:r>
+              <w:t>Average of the selected suppliers on the relevant metric</w:t>
+            </w:r>
+          </w:p>
+        </w:tc>
+      </w:tr>
+      <w:tr>
+        <w:trPr>
+          <w:jc w:val="center"/>
+        </w:trPr>
+        <w:tc>
+          <w:tcPr>
+            <w:tcW w:w="4896" w:type="dxa"/>
+            <w:shd w:val="clear" w:color="auto" w:fill="EAF1F8"/>
+            <w:tcMar>
+              <w:top w:w="80" w:type="dxa"/>
+              <w:left w:w="110" w:type="dxa"/>
+              <w:bottom w:w="80" w:type="dxa"/>
+              <w:right w:w="110" w:type="dxa"/>
+            </w:tcMar>
+            <w:vAlign w:val="center"/>
+          </w:tcPr>
+          <w:p>
+            <w:pPr>
+              <w:spacing w:after="0"/>
+            </w:pPr>
+            <w:proofErr w:type="spellStart"/>
+            <w:r>
+              <w:t>served_users</w:t>
+            </w:r>
+            <w:proofErr w:type="spellEnd"/>
+          </w:p>
+        </w:tc>
+        <w:tc>
+          <w:tcPr>
+            <w:tcW w:w="4896" w:type="dxa"/>
+            <w:shd w:val="clear" w:color="auto" w:fill="FCFEFF"/>
+            <w:tcMar>
+              <w:top w:w="80" w:type="dxa"/>
+              <w:left w:w="110" w:type="dxa"/>
+              <w:bottom w:w="80" w:type="dxa"/>
+              <w:right w:w="110" w:type="dxa"/>
+            </w:tcMar>
+            <w:vAlign w:val="center"/>
+          </w:tcPr>
+          <w:p>
+            <w:pPr>
+              <w:spacing w:after="0"/>
+            </w:pPr>
+            <w:r>
+              <w:t>Number of users served; the default value in the code is 8</w:t>
+            </w:r>
+          </w:p>
+        </w:tc>
+      </w:tr>
+      <w:tr>
+        <w:trPr>
+          <w:jc w:val="center"/>
+        </w:trPr>
+        <w:tc>
+          <w:tcPr>
+            <w:tcW w:w="4896" w:type="dxa"/>
+            <w:shd w:val="clear" w:color="auto" w:fill="EAF1F8"/>
+            <w:tcMar>
+              <w:top w:w="80" w:type="dxa"/>
+              <w:left w:w="110" w:type="dxa"/>
+              <w:bottom w:w="80" w:type="dxa"/>
+              <w:right w:w="110" w:type="dxa"/>
+            </w:tcMar>
+            <w:vAlign w:val="center"/>
+          </w:tcPr>
+          <w:p>
+            <w:pPr>
+              <w:spacing w:after="0"/>
+            </w:pPr>
+            <w:proofErr w:type="spellStart"/>
+            <w:r>
+              <w:t>env_cap</w:t>
+            </w:r>
+            <w:proofErr w:type="spellEnd"/>
+            <w:r>
+              <w:t xml:space="preserve">, </w:t>
+            </w:r>
+            <w:proofErr w:type="spellStart"/>
+            <w:r>
+              <w:t>social_cap</w:t>
+            </w:r>
+            <w:proofErr w:type="spellEnd"/>
+          </w:p>
+        </w:tc>
+        <w:tc>
+          <w:tcPr>
+            <w:tcW w:w="4896" w:type="dxa"/>
+            <w:shd w:val="clear" w:color="auto" w:fill="FCFEFF"/>
+            <w:tcMar>
+              <w:top w:w="80" w:type="dxa"/>
+              <w:left w:w="110" w:type="dxa"/>
+              <w:bottom w:w="80" w:type="dxa"/>
+              <w:right w:w="110" w:type="dxa"/>
+            </w:tcMar>
+            <w:vAlign w:val="center"/>
+          </w:tcPr>
+          <w:p>
+            <w:pPr>
+              <w:spacing w:after="0"/>
+            </w:pPr>
+            <w:r>
+              <w:t>Upper bounds for average environmental and social risk</w:t>
+            </w:r>
+          </w:p>
+        </w:tc>
+      </w:tr>
+    </w:tbl>
     <w:p/>
     <w:p/>
     <w:sectPr>

</xml_diff>